<commit_message>
Shorten Superman cover letter
Co-Authored-By: Claude Opus 5.5 <noreply@anthropic.com>
Claude-Session: https://claude.ai/code/session_01FBuHsgfNN7NePtiYw7LpVx
</commit_message>
<xml_diff>
--- a/Superman_Cover_Letter.docx
+++ b/Superman_Cover_Letter.docx
@@ -56,21 +56,21 @@
     </w:p>
     <w:p>
       <w:pPr>
-        <w:spacing w:after="240" w:line="300"/>
-      </w:pPr>
-      <w:r>
-        <w:rPr>
-          <w:rFonts w:ascii="Cambria" w:cs="Cambria" w:eastAsia="Cambria" w:hAnsi="Cambria"/>
-          <w:color w:val="111111"/>
-          <w:sz w:val="23"/>
-          <w:szCs w:val="23"/>
+        <w:spacing w:after="240" w:line="320"/>
+      </w:pPr>
+      <w:r>
+        <w:rPr>
+          <w:rFonts w:ascii="Cambria" w:cs="Cambria" w:eastAsia="Cambria" w:hAnsi="Cambria"/>
+          <w:color w:val="111111"/>
+          <w:sz w:val="25"/>
+          <w:szCs w:val="25"/>
         </w:rPr>
         <w:t xml:space="preserve">October 21, 2026</w:t>
       </w:r>
     </w:p>
     <w:p>
       <w:pPr>
-        <w:spacing w:after="0" w:line="300"/>
+        <w:spacing w:after="0" w:line="320"/>
       </w:pPr>
       <w:r>
         <w:rPr>
@@ -78,141 +78,141 @@
           <w:b/>
           <w:bCs/>
           <w:color w:val="111111"/>
-          <w:sz w:val="23"/>
-          <w:szCs w:val="23"/>
+          <w:sz w:val="25"/>
+          <w:szCs w:val="25"/>
         </w:rPr>
         <w:t xml:space="preserve">Hiring Manager</w:t>
       </w:r>
     </w:p>
     <w:p>
       <w:pPr>
-        <w:spacing w:after="0" w:line="300"/>
-      </w:pPr>
-      <w:r>
-        <w:rPr>
-          <w:rFonts w:ascii="Cambria" w:cs="Cambria" w:eastAsia="Cambria" w:hAnsi="Cambria"/>
-          <w:color w:val="111111"/>
-          <w:sz w:val="23"/>
-          <w:szCs w:val="23"/>
+        <w:spacing w:after="0" w:line="320"/>
+      </w:pPr>
+      <w:r>
+        <w:rPr>
+          <w:rFonts w:ascii="Cambria" w:cs="Cambria" w:eastAsia="Cambria" w:hAnsi="Cambria"/>
+          <w:color w:val="111111"/>
+          <w:sz w:val="25"/>
+          <w:szCs w:val="25"/>
         </w:rPr>
         <w:t xml:space="preserve">Safe City Company</w:t>
       </w:r>
     </w:p>
     <w:p>
       <w:pPr>
-        <w:spacing w:after="300" w:line="300"/>
-      </w:pPr>
-      <w:r>
-        <w:rPr>
-          <w:rFonts w:ascii="Cambria" w:cs="Cambria" w:eastAsia="Cambria" w:hAnsi="Cambria"/>
-          <w:color w:val="111111"/>
-          <w:sz w:val="23"/>
-          <w:szCs w:val="23"/>
+        <w:spacing w:after="300" w:line="320"/>
+      </w:pPr>
+      <w:r>
+        <w:rPr>
+          <w:rFonts w:ascii="Cambria" w:cs="Cambria" w:eastAsia="Cambria" w:hAnsi="Cambria"/>
+          <w:color w:val="111111"/>
+          <w:sz w:val="25"/>
+          <w:szCs w:val="25"/>
         </w:rPr>
         <w:t xml:space="preserve">Metropolis, USA</w:t>
       </w:r>
     </w:p>
     <w:p>
       <w:pPr>
-        <w:spacing w:after="240" w:line="300"/>
-      </w:pPr>
-      <w:r>
-        <w:rPr>
-          <w:rFonts w:ascii="Cambria" w:cs="Cambria" w:eastAsia="Cambria" w:hAnsi="Cambria"/>
-          <w:color w:val="111111"/>
-          <w:sz w:val="23"/>
-          <w:szCs w:val="23"/>
+        <w:spacing w:after="240" w:line="320"/>
+      </w:pPr>
+      <w:r>
+        <w:rPr>
+          <w:rFonts w:ascii="Cambria" w:cs="Cambria" w:eastAsia="Cambria" w:hAnsi="Cambria"/>
+          <w:color w:val="111111"/>
+          <w:sz w:val="25"/>
+          <w:szCs w:val="25"/>
         </w:rPr>
         <w:t xml:space="preserve">Dear Hiring Manager,</w:t>
       </w:r>
     </w:p>
     <w:p>
       <w:pPr>
-        <w:spacing w:after="200" w:line="300"/>
-      </w:pPr>
-      <w:r>
-        <w:rPr>
-          <w:rFonts w:ascii="Cambria" w:cs="Cambria" w:eastAsia="Cambria" w:hAnsi="Cambria"/>
-          <w:color w:val="111111"/>
-          <w:sz w:val="23"/>
-          <w:szCs w:val="23"/>
-        </w:rPr>
-        <w:t xml:space="preserve">My name is Superman, and I am a Global Safety Expert with 85+ years of experience. I saw your job post on LinkedIn for the Safety Team Leader role, and I am writing to apply for this job.</w:t>
-      </w:r>
-    </w:p>
-    <w:p>
-      <w:pPr>
-        <w:spacing w:after="200" w:line="300"/>
-      </w:pPr>
-      <w:r>
-        <w:rPr>
-          <w:rFonts w:ascii="Cambria" w:cs="Cambria" w:eastAsia="Cambria" w:hAnsi="Cambria"/>
-          <w:color w:val="111111"/>
-          <w:sz w:val="23"/>
-          <w:szCs w:val="23"/>
-        </w:rPr>
-        <w:t xml:space="preserve">I can offer you strong leadership, fast decisions and a lot of experience in keeping people safe. For example, when a big fire started in Metropolis, my task was to save the people inside the buildings. I worked with the fire team, flew in, and moved everyone to a safe place in minutes. As a result, we saved 300 people, and no one was hurt.</w:t>
-      </w:r>
-    </w:p>
-    <w:p>
-      <w:pPr>
-        <w:spacing w:after="200" w:line="300"/>
-      </w:pPr>
-      <w:r>
-        <w:rPr>
-          <w:rFonts w:ascii="Cambria" w:cs="Cambria" w:eastAsia="Cambria" w:hAnsi="Cambria"/>
-          <w:color w:val="111111"/>
-          <w:sz w:val="23"/>
-          <w:szCs w:val="23"/>
-        </w:rPr>
-        <w:t xml:space="preserve">Your job post asks for a leader who can work under pressure, lead a team and make fast decisions. I do this every day as the leader of the Hero Team, where we have a 99% success rate.</w:t>
-      </w:r>
-    </w:p>
-    <w:p>
-      <w:pPr>
-        <w:spacing w:after="200" w:line="300"/>
-      </w:pPr>
-      <w:r>
-        <w:rPr>
-          <w:rFonts w:ascii="Cambria" w:cs="Cambria" w:eastAsia="Cambria" w:hAnsi="Cambria"/>
-          <w:color w:val="111111"/>
-          <w:sz w:val="23"/>
-          <w:szCs w:val="23"/>
-        </w:rPr>
-        <w:t xml:space="preserve">I want to work for Safe City Company because you help people feel safe in their homes and streets, and this is my mission too. I also have a degree in Media from Sky University and certificates in First Aid and Team Leadership, because I always want to learn more.</w:t>
-      </w:r>
-    </w:p>
-    <w:p>
-      <w:pPr>
-        <w:spacing w:after="360" w:line="300"/>
-      </w:pPr>
-      <w:r>
-        <w:rPr>
-          <w:rFonts w:ascii="Cambria" w:cs="Cambria" w:eastAsia="Cambria" w:hAnsi="Cambria"/>
-          <w:color w:val="111111"/>
-          <w:sz w:val="23"/>
-          <w:szCs w:val="23"/>
-        </w:rPr>
-        <w:t xml:space="preserve">Thank you for your time. I would love the chance to meet you for an interview, and I am ready to start right away.</w:t>
-      </w:r>
-    </w:p>
-    <w:p>
-      <w:pPr>
-        <w:spacing w:after="120" w:line="300"/>
-      </w:pPr>
-      <w:r>
-        <w:rPr>
-          <w:rFonts w:ascii="Cambria" w:cs="Cambria" w:eastAsia="Cambria" w:hAnsi="Cambria"/>
-          <w:color w:val="111111"/>
-          <w:sz w:val="23"/>
-          <w:szCs w:val="23"/>
+        <w:spacing w:after="200" w:line="320"/>
+      </w:pPr>
+      <w:r>
+        <w:rPr>
+          <w:rFonts w:ascii="Cambria" w:cs="Cambria" w:eastAsia="Cambria" w:hAnsi="Cambria"/>
+          <w:color w:val="111111"/>
+          <w:sz w:val="25"/>
+          <w:szCs w:val="25"/>
+        </w:rPr>
+        <w:t xml:space="preserve">My name is Superman, a Global Safety Expert with 85+ years of experience. I saw your job post on LinkedIn, and I want to apply for the Safety Team Leader role.</w:t>
+      </w:r>
+    </w:p>
+    <w:p>
+      <w:pPr>
+        <w:spacing w:after="200" w:line="320"/>
+      </w:pPr>
+      <w:r>
+        <w:rPr>
+          <w:rFonts w:ascii="Cambria" w:cs="Cambria" w:eastAsia="Cambria" w:hAnsi="Cambria"/>
+          <w:color w:val="111111"/>
+          <w:sz w:val="25"/>
+          <w:szCs w:val="25"/>
+        </w:rPr>
+        <w:t xml:space="preserve">When a big fire started in Metropolis, I had to save the people inside. I worked with the fire team and moved everyone to safety in minutes. We saved 300 people.</w:t>
+      </w:r>
+    </w:p>
+    <w:p>
+      <w:pPr>
+        <w:spacing w:after="200" w:line="320"/>
+      </w:pPr>
+      <w:r>
+        <w:rPr>
+          <w:rFonts w:ascii="Cambria" w:cs="Cambria" w:eastAsia="Cambria" w:hAnsi="Cambria"/>
+          <w:color w:val="111111"/>
+          <w:sz w:val="25"/>
+          <w:szCs w:val="25"/>
+        </w:rPr>
+        <w:t xml:space="preserve">Your job needs a leader who makes fast decisions. I lead the Hero Team with a 99% success rate.</w:t>
+      </w:r>
+    </w:p>
+    <w:p>
+      <w:pPr>
+        <w:spacing w:after="200" w:line="320"/>
+      </w:pPr>
+      <w:r>
+        <w:rPr>
+          <w:rFonts w:ascii="Cambria" w:cs="Cambria" w:eastAsia="Cambria" w:hAnsi="Cambria"/>
+          <w:color w:val="111111"/>
+          <w:sz w:val="25"/>
+          <w:szCs w:val="25"/>
+        </w:rPr>
+        <w:t xml:space="preserve">I want to join Safe City Company because you keep people safe, and this is my mission too.</w:t>
+      </w:r>
+    </w:p>
+    <w:p>
+      <w:pPr>
+        <w:spacing w:after="360" w:line="320"/>
+      </w:pPr>
+      <w:r>
+        <w:rPr>
+          <w:rFonts w:ascii="Cambria" w:cs="Cambria" w:eastAsia="Cambria" w:hAnsi="Cambria"/>
+          <w:color w:val="111111"/>
+          <w:sz w:val="25"/>
+          <w:szCs w:val="25"/>
+        </w:rPr>
+        <w:t xml:space="preserve">Thank you for your time. I hope to meet you for an interview.</w:t>
+      </w:r>
+    </w:p>
+    <w:p>
+      <w:pPr>
+        <w:spacing w:after="120" w:line="320"/>
+      </w:pPr>
+      <w:r>
+        <w:rPr>
+          <w:rFonts w:ascii="Cambria" w:cs="Cambria" w:eastAsia="Cambria" w:hAnsi="Cambria"/>
+          <w:color w:val="111111"/>
+          <w:sz w:val="25"/>
+          <w:szCs w:val="25"/>
         </w:rPr>
         <w:t xml:space="preserve">Sincerely,</w:t>
       </w:r>
     </w:p>
     <w:p>
       <w:pPr>
-        <w:spacing w:after="0" w:line="300"/>
+        <w:spacing w:after="0" w:line="320"/>
       </w:pPr>
       <w:r>
         <w:rPr>

</xml_diff>

<commit_message>
Trim Superman cover letter
Co-Authored-By: Claude Opus 5.5 <noreply@anthropic.com>
Claude-Session: https://claude.ai/code/session_01FBuHsgfNN7NePtiYw7LpVx
</commit_message>
<xml_diff>
--- a/Superman_Cover_Letter.docx
+++ b/Superman_Cover_Letter.docx
@@ -137,7 +137,7 @@
           <w:sz w:val="25"/>
           <w:szCs w:val="25"/>
         </w:rPr>
-        <w:t xml:space="preserve">My name is Superman, and I am a Global Safety Expert with 85+ years of experience. I saw your job post on LinkedIn, and I am happy to apply for the Safety Team Leader role at Safe City Company.</w:t>
+        <w:t xml:space="preserve">My name is Superman, a Global Safety Expert with 85+ years of experience. I saw your job post on LinkedIn, and I am happy to apply for the Safety Team Leader role.</w:t>
       </w:r>
     </w:p>
     <w:p>
@@ -151,7 +151,7 @@
           <w:sz w:val="25"/>
           <w:szCs w:val="25"/>
         </w:rPr>
-        <w:t xml:space="preserve">I can offer strong leadership and fast action in hard times. For example, when a big fire started in Metropolis, I had to save the people inside. I worked with the fire team and moved everyone to safety in minutes. Together, we saved 300 people, and no one was hurt.</w:t>
+        <w:t xml:space="preserve">When a big fire started in Metropolis, I had to save the people inside. I worked with the fire team and moved everyone to safety in minutes. We saved 300 people, and no one was hurt.</w:t>
       </w:r>
     </w:p>
     <w:p>
@@ -165,7 +165,7 @@
           <w:sz w:val="25"/>
           <w:szCs w:val="25"/>
         </w:rPr>
-        <w:t xml:space="preserve">Your job needs a leader who can make fast decisions and lead a team. I lead the Hero Team with Batman and Wonder Woman, and we have a 99% success rate.</w:t>
+        <w:t xml:space="preserve">Your job needs a leader who makes fast decisions. I lead the Hero Team with a 99% success rate.</w:t>
       </w:r>
     </w:p>
     <w:p>
@@ -179,7 +179,7 @@
           <w:sz w:val="25"/>
           <w:szCs w:val="25"/>
         </w:rPr>
-        <w:t xml:space="preserve">I want to join Safe City Company because you help people feel safe in their homes and streets, and this is my mission too. I also have certificates in First Aid and Team Leadership, and I always want to learn more.</w:t>
+        <w:t xml:space="preserve">I want to join Safe City Company because you keep people safe, and this is my mission too. I also have certificates in First Aid and Team Leadership.</w:t>
       </w:r>
     </w:p>
     <w:p>
@@ -193,7 +193,7 @@
           <w:sz w:val="25"/>
           <w:szCs w:val="25"/>
         </w:rPr>
-        <w:t xml:space="preserve">Thank you for your time. I would love to meet you for an interview, and I am ready to start right away.</w:t>
+        <w:t xml:space="preserve">Thank you for your time. I would love to meet you for an interview.</w:t>
       </w:r>
     </w:p>
     <w:p>

</xml_diff>